<commit_message>
Polish court PDFs: tight signature, cert before /s/, honest CO labels
Single-space the signature block and keep it together. Put NJ R. 1:4-4(b)
above the signature so one date and /s/ close the paper; put the
certificate of service on its own last page with its own date and /s/.
Drop the duplicate Appellate Division line and Division/Courtroom filler.
Print filer address and email in the caption when the draft supplies them.
Mark CO C.R.C.P. 121 conferral and C.R.S. § 13-27-106 as needs_verification
user text, not asserted court labels. Remove the leftover Court Markdown
block from the Documents tab.

Co-authored-by: Joshua M. Abrams <josh@truejust.org>
</commit_message>
<xml_diff>
--- a/docs/samples/co-appeals-motion-jordan-example.docx
+++ b/docs/samples/co-appeals-motion-jordan-example.docx
@@ -25,7 +25,7 @@
           <w:p>
             <w:pPr>
               <w:jc w:val="both"/>
-              <w:spacing w:line="240" w:lineRule="auto"/>
+              <w:spacing w:after="0" w:line="240" w:lineRule="auto"/>
             </w:pPr>
             <w:r>
               <w:rPr>
@@ -39,21 +39,7 @@
           <w:p>
             <w:pPr>
               <w:jc w:val="both"/>
-              <w:spacing w:line="240" w:lineRule="auto"/>
-            </w:pPr>
-            <w:r>
-              <w:rPr>
-                <w:rFonts w:ascii="Times New Roman" w:hAnsi="Times New Roman" w:cs="Times New Roman"/>
-                <w:sz w:val="20"/>
-                <w:szCs w:val="20"/>
-              </w:rPr>
-              <w:t xml:space="preserve">Court of Appeals</w:t>
-            </w:r>
-          </w:p>
-          <w:p>
-            <w:pPr>
-              <w:jc w:val="both"/>
-              <w:spacing w:line="240" w:lineRule="auto"/>
+              <w:spacing w:after="0" w:line="240" w:lineRule="auto"/>
             </w:pPr>
             <w:r>
               <w:rPr>
@@ -67,7 +53,7 @@
           <w:p>
             <w:pPr>
               <w:jc w:val="both"/>
-              <w:spacing w:line="240" w:lineRule="auto"/>
+              <w:spacing w:after="0" w:line="240" w:lineRule="auto"/>
             </w:pPr>
             <w:r>
               <w:rPr>
@@ -81,7 +67,7 @@
           <w:p>
             <w:pPr>
               <w:jc w:val="both"/>
-              <w:spacing w:line="240" w:lineRule="auto"/>
+              <w:spacing w:after="0" w:line="240" w:lineRule="auto"/>
             </w:pPr>
             <w:r>
               <w:rPr>
@@ -95,7 +81,7 @@
           <w:p>
             <w:pPr>
               <w:jc w:val="both"/>
-              <w:spacing w:line="240" w:lineRule="auto"/>
+              <w:spacing w:after="0" w:line="240" w:lineRule="auto"/>
             </w:pPr>
             <w:r>
               <w:rPr>
@@ -109,7 +95,7 @@
           <w:p>
             <w:pPr>
               <w:jc w:val="both"/>
-              <w:spacing w:line="240" w:lineRule="auto"/>
+              <w:spacing w:after="0" w:line="240" w:lineRule="auto"/>
             </w:pPr>
             <w:r>
               <w:rPr>
@@ -123,7 +109,7 @@
           <w:p>
             <w:pPr>
               <w:jc w:val="both"/>
-              <w:spacing w:line="240" w:lineRule="auto"/>
+              <w:spacing w:after="0" w:line="240" w:lineRule="auto"/>
             </w:pPr>
             <w:r>
               <w:rPr>
@@ -137,7 +123,7 @@
           <w:p>
             <w:pPr>
               <w:jc w:val="both"/>
-              <w:spacing w:line="240" w:lineRule="auto"/>
+              <w:spacing w:after="0" w:line="240" w:lineRule="auto"/>
             </w:pPr>
             <w:r>
               <w:rPr>
@@ -151,7 +137,7 @@
           <w:p>
             <w:pPr>
               <w:jc w:val="both"/>
-              <w:spacing w:line="240" w:lineRule="auto"/>
+              <w:spacing w:after="0" w:line="240" w:lineRule="auto"/>
             </w:pPr>
             <w:r>
               <w:rPr>
@@ -160,6 +146,62 @@
                 <w:szCs w:val="20"/>
               </w:rPr>
               <w:t xml:space="preserve">Jordan Example, Pro Se</w:t>
+            </w:r>
+          </w:p>
+          <w:p>
+            <w:pPr>
+              <w:jc w:val="both"/>
+              <w:spacing w:after="0" w:line="240" w:lineRule="auto"/>
+            </w:pPr>
+            <w:r>
+              <w:rPr>
+                <w:rFonts w:ascii="Times New Roman" w:hAnsi="Times New Roman" w:cs="Times New Roman"/>
+                <w:sz w:val="20"/>
+                <w:szCs w:val="20"/>
+              </w:rPr>
+              <w:t xml:space="preserve">100 Sample Street</w:t>
+            </w:r>
+          </w:p>
+          <w:p>
+            <w:pPr>
+              <w:jc w:val="both"/>
+              <w:spacing w:after="0" w:line="240" w:lineRule="auto"/>
+            </w:pPr>
+            <w:r>
+              <w:rPr>
+                <w:rFonts w:ascii="Times New Roman" w:hAnsi="Times New Roman" w:cs="Times New Roman"/>
+                <w:sz w:val="20"/>
+                <w:szCs w:val="20"/>
+              </w:rPr>
+              <w:t xml:space="preserve">Example City, ST 00000</w:t>
+            </w:r>
+          </w:p>
+          <w:p>
+            <w:pPr>
+              <w:jc w:val="both"/>
+              <w:spacing w:after="0" w:line="240" w:lineRule="auto"/>
+            </w:pPr>
+            <w:r>
+              <w:rPr>
+                <w:rFonts w:ascii="Times New Roman" w:hAnsi="Times New Roman" w:cs="Times New Roman"/>
+                <w:sz w:val="20"/>
+                <w:szCs w:val="20"/>
+              </w:rPr>
+              <w:t xml:space="preserve">jordan.example@example.test</w:t>
+            </w:r>
+          </w:p>
+          <w:p>
+            <w:pPr>
+              <w:jc w:val="both"/>
+              <w:spacing w:after="0" w:line="240" w:lineRule="auto"/>
+            </w:pPr>
+            <w:r>
+              <w:rPr>
+                <w:rFonts w:ascii="Times New Roman" w:hAnsi="Times New Roman" w:cs="Times New Roman"/>
+                <w:sz w:val="20"/>
+                <w:szCs w:val="20"/>
+              </w:rPr>
+              <w:t xml:space="preserve">555-0100</w:t>
             </w:r>
           </w:p>
         </w:tc>
@@ -176,7 +218,7 @@
           <w:p>
             <w:pPr>
               <w:jc w:val="both"/>
-              <w:spacing w:line="240" w:lineRule="auto"/>
+              <w:spacing w:after="0" w:line="240" w:lineRule="auto"/>
             </w:pPr>
             <w:r>
               <w:rPr>
@@ -190,7 +232,7 @@
           <w:p>
             <w:pPr>
               <w:jc w:val="both"/>
-              <w:spacing w:line="240" w:lineRule="auto"/>
+              <w:spacing w:after="0" w:line="240" w:lineRule="auto"/>
             </w:pPr>
             <w:r>
               <w:rPr>
@@ -204,7 +246,7 @@
           <w:p>
             <w:pPr>
               <w:jc w:val="both"/>
-              <w:spacing w:line="240" w:lineRule="auto"/>
+              <w:spacing w:after="0" w:line="240" w:lineRule="auto"/>
             </w:pPr>
             <w:r>
               <w:rPr>
@@ -218,7 +260,7 @@
           <w:p>
             <w:pPr>
               <w:jc w:val="both"/>
-              <w:spacing w:line="240" w:lineRule="auto"/>
+              <w:spacing w:after="0" w:line="240" w:lineRule="auto"/>
             </w:pPr>
             <w:r>
               <w:rPr>
@@ -232,7 +274,7 @@
           <w:p>
             <w:pPr>
               <w:jc w:val="both"/>
-              <w:spacing w:line="240" w:lineRule="auto"/>
+              <w:spacing w:after="0" w:line="240" w:lineRule="auto"/>
             </w:pPr>
             <w:r>
               <w:rPr>
@@ -260,7 +302,7 @@
           <w:p>
             <w:pPr>
               <w:jc w:val="center"/>
-              <w:spacing w:line="240" w:lineRule="auto"/>
+              <w:spacing w:after="0" w:line="240" w:lineRule="auto"/>
             </w:pPr>
             <w:r>
               <w:rPr>
@@ -283,7 +325,7 @@
     <w:p>
       <w:pPr>
         <w:jc w:val="both"/>
-        <w:spacing w:line="480" w:lineRule="auto"/>
+        <w:spacing w:after="200" w:line="480" w:lineRule="auto"/>
       </w:pPr>
       <w:r>
         <w:rPr>
@@ -292,13 +334,13 @@
           <w:szCs w:val="24"/>
           <w:b/>
         </w:rPr>
-        <w:t xml:space="preserve">CERTIFICATE OF CONFERRAL</w:t>
-      </w:r>
-    </w:p>
-    <w:p>
-      <w:pPr>
-        <w:jc w:val="both"/>
-        <w:spacing w:line="480" w:lineRule="auto"/>
+        <w:t xml:space="preserve">CONFERRAL</w:t>
+      </w:r>
+    </w:p>
+    <w:p>
+      <w:pPr>
+        <w:jc w:val="both"/>
+        <w:spacing w:after="0" w:line="480" w:lineRule="auto"/>
       </w:pPr>
       <w:r>
         <w:rPr>
@@ -312,21 +354,21 @@
     <w:p>
       <w:pPr>
         <w:jc w:val="both"/>
-        <w:spacing w:line="480" w:lineRule="auto"/>
-      </w:pPr>
-      <w:r>
-        <w:rPr>
-          <w:rFonts w:ascii="Times New Roman" w:hAnsi="Times New Roman" w:cs="Times New Roman"/>
-          <w:sz w:val="24"/>
-          <w:szCs w:val="24"/>
-        </w:rPr>
-        <w:t xml:space="preserve">Certificate of Conferral (C.R.C.P. 121 § 1-15(8)): Undersigned conferred in good faith with the opposing party on October 1, 2026. The opposing party takes no position. This sentence is the user's own draft.</w:t>
-      </w:r>
-    </w:p>
-    <w:p>
-      <w:pPr>
-        <w:jc w:val="both"/>
-        <w:spacing w:line="480" w:lineRule="auto"/>
+        <w:spacing w:after="0" w:line="480" w:lineRule="auto"/>
+      </w:pPr>
+      <w:r>
+        <w:rPr>
+          <w:rFonts w:ascii="Times New Roman" w:hAnsi="Times New Roman" w:cs="Times New Roman"/>
+          <w:sz w:val="24"/>
+          <w:szCs w:val="24"/>
+        </w:rPr>
+        <w:t xml:space="preserve">I conferred with the opposing party on October 1, 2026. The opposing party takes no position. Confirm whether C.R.C.P. 121 § 1-15(8) or the Colorado Appellate Rules govern this paper before filing. This paragraph is the user's own draft (needs_verification).</w:t>
+      </w:r>
+    </w:p>
+    <w:p>
+      <w:pPr>
+        <w:jc w:val="both"/>
+        <w:spacing w:after="0" w:line="480" w:lineRule="auto"/>
       </w:pPr>
       <w:r>
         <w:rPr>
@@ -340,7 +382,7 @@
     <w:p>
       <w:pPr>
         <w:jc w:val="both"/>
-        <w:spacing w:line="480" w:lineRule="auto"/>
+        <w:spacing w:after="200" w:line="480" w:lineRule="auto"/>
       </w:pPr>
       <w:r>
         <w:rPr>
@@ -355,7 +397,7 @@
     <w:p>
       <w:pPr>
         <w:jc w:val="both"/>
-        <w:spacing w:line="480" w:lineRule="auto"/>
+        <w:spacing w:after="0" w:line="480" w:lineRule="auto"/>
       </w:pPr>
       <w:r>
         <w:rPr>
@@ -369,7 +411,7 @@
     <w:p>
       <w:pPr>
         <w:jc w:val="both"/>
-        <w:spacing w:line="480" w:lineRule="auto"/>
+        <w:spacing w:after="0" w:line="480" w:lineRule="auto"/>
       </w:pPr>
       <w:r>
         <w:rPr>
@@ -383,7 +425,7 @@
     <w:p>
       <w:pPr>
         <w:jc w:val="both"/>
-        <w:spacing w:line="480" w:lineRule="auto"/>
+        <w:spacing w:after="0" w:line="480" w:lineRule="auto"/>
       </w:pPr>
       <w:r>
         <w:rPr>
@@ -396,8 +438,43 @@
     </w:p>
     <w:p>
       <w:pPr>
-        <w:jc w:val="both"/>
-        <w:spacing w:line="480" w:lineRule="auto"/>
+        <w:jc w:val="center"/>
+        <w:spacing w:after="120" w:line="480" w:lineRule="auto"/>
+        <w:keepNext/>
+        <w:keepLines/>
+      </w:pPr>
+      <w:r>
+        <w:rPr>
+          <w:rFonts w:ascii="Times New Roman" w:hAnsi="Times New Roman" w:cs="Times New Roman"/>
+          <w:sz w:val="24"/>
+          <w:szCs w:val="24"/>
+          <w:b/>
+        </w:rPr>
+        <w:t xml:space="preserve">Declaration</w:t>
+      </w:r>
+    </w:p>
+    <w:p>
+      <w:pPr>
+        <w:jc w:val="both"/>
+        <w:spacing w:after="160" w:line="480" w:lineRule="auto"/>
+        <w:keepNext/>
+        <w:keepLines/>
+      </w:pPr>
+      <w:r>
+        <w:rPr>
+          <w:rFonts w:ascii="Times New Roman" w:hAnsi="Times New Roman" w:cs="Times New Roman"/>
+          <w:sz w:val="24"/>
+          <w:szCs w:val="24"/>
+        </w:rPr>
+        <w:t xml:space="preserve">I declare under penalty of perjury under the law of Colorado that the foregoing is true and correct. I signed this on October 16, 2026, at Example City, ST. This declaration is the user's own draft (needs_verification).</w:t>
+      </w:r>
+    </w:p>
+    <w:p>
+      <w:pPr>
+        <w:jc w:val="both"/>
+        <w:spacing w:after="0" w:line="240" w:lineRule="auto"/>
+        <w:keepNext/>
+        <w:keepLines/>
       </w:pPr>
       <w:r>
         <w:rPr>
@@ -411,7 +488,9 @@
     <w:p>
       <w:pPr>
         <w:jc w:val="both"/>
-        <w:spacing w:line="480" w:lineRule="auto"/>
+        <w:spacing w:after="0" w:line="240" w:lineRule="auto"/>
+        <w:keepNext/>
+        <w:keepLines/>
       </w:pPr>
       <w:r>
         <w:rPr>
@@ -425,7 +504,9 @@
     <w:p>
       <w:pPr>
         <w:jc w:val="both"/>
-        <w:spacing w:line="480" w:lineRule="auto"/>
+        <w:spacing w:after="0" w:line="240" w:lineRule="auto"/>
+        <w:keepNext/>
+        <w:keepLines/>
       </w:pPr>
       <w:r>
         <w:rPr>
@@ -439,7 +520,9 @@
     <w:p>
       <w:pPr>
         <w:jc w:val="both"/>
-        <w:spacing w:line="480" w:lineRule="auto"/>
+        <w:spacing w:after="0" w:line="240" w:lineRule="auto"/>
+        <w:keepNext/>
+        <w:keepLines/>
       </w:pPr>
       <w:r>
         <w:rPr>
@@ -453,7 +536,9 @@
     <w:p>
       <w:pPr>
         <w:jc w:val="both"/>
-        <w:spacing w:line="480" w:lineRule="auto"/>
+        <w:spacing w:after="0" w:line="240" w:lineRule="auto"/>
+        <w:keepNext/>
+        <w:keepLines/>
       </w:pPr>
       <w:r>
         <w:rPr>
@@ -467,7 +552,9 @@
     <w:p>
       <w:pPr>
         <w:jc w:val="both"/>
-        <w:spacing w:line="480" w:lineRule="auto"/>
+        <w:spacing w:after="0" w:line="240" w:lineRule="auto"/>
+        <w:keepNext/>
+        <w:keepLines/>
       </w:pPr>
       <w:r>
         <w:rPr>
@@ -481,7 +568,9 @@
     <w:p>
       <w:pPr>
         <w:jc w:val="both"/>
-        <w:spacing w:line="480" w:lineRule="auto"/>
+        <w:spacing w:after="0" w:line="240" w:lineRule="auto"/>
+        <w:keepNext/>
+        <w:keepLines/>
       </w:pPr>
       <w:r>
         <w:rPr>
@@ -494,8 +583,43 @@
     </w:p>
     <w:p>
       <w:pPr>
+        <w:jc w:val="both"/>
+        <w:spacing w:after="0" w:line="240" w:lineRule="auto"/>
+        <w:keepNext/>
+        <w:keepLines/>
+      </w:pPr>
+      <w:r>
+        <w:rPr>
+          <w:rFonts w:ascii="Times New Roman" w:hAnsi="Times New Roman" w:cs="Times New Roman"/>
+          <w:sz w:val="24"/>
+          <w:szCs w:val="24"/>
+        </w:rPr>
+        <w:t xml:space="preserve">jordan.example@example.test</w:t>
+      </w:r>
+    </w:p>
+    <w:p>
+      <w:pPr>
+        <w:jc w:val="both"/>
+        <w:spacing w:after="0" w:line="240" w:lineRule="auto"/>
+      </w:pPr>
+      <w:r>
+        <w:rPr>
+          <w:rFonts w:ascii="Times New Roman" w:hAnsi="Times New Roman" w:cs="Times New Roman"/>
+          <w:sz w:val="24"/>
+          <w:szCs w:val="24"/>
+        </w:rPr>
+        <w:t xml:space="preserve">555-0100</w:t>
+      </w:r>
+    </w:p>
+    <w:p>
+      <w:r>
+        <w:br w:type="page"/>
+      </w:r>
+    </w:p>
+    <w:p>
+      <w:pPr>
         <w:jc w:val="center"/>
-        <w:spacing w:line="480" w:lineRule="auto"/>
+        <w:spacing w:after="0" w:line="480" w:lineRule="auto"/>
       </w:pPr>
       <w:r>
         <w:rPr>
@@ -504,42 +628,13 @@
           <w:szCs w:val="24"/>
           <w:b/>
         </w:rPr>
-        <w:t xml:space="preserve">DECLARATION UNDER C.R.S. § 13-27-106</w:t>
-      </w:r>
-    </w:p>
-    <w:p>
-      <w:pPr>
-        <w:jc w:val="both"/>
-        <w:spacing w:line="480" w:lineRule="auto"/>
-      </w:pPr>
-      <w:r>
-        <w:rPr>
-          <w:rFonts w:ascii="Times New Roman" w:hAnsi="Times New Roman" w:cs="Times New Roman"/>
-          <w:sz w:val="24"/>
-          <w:szCs w:val="24"/>
-        </w:rPr>
-        <w:t xml:space="preserve">I declare under penalty of perjury under the law of Colorado that the foregoing is true and correct.</w:t>
-      </w:r>
-    </w:p>
-    <w:p>
-      <w:pPr>
-        <w:jc w:val="center"/>
-        <w:spacing w:line="480" w:lineRule="auto"/>
-      </w:pPr>
-      <w:r>
-        <w:rPr>
-          <w:rFonts w:ascii="Times New Roman" w:hAnsi="Times New Roman" w:cs="Times New Roman"/>
-          <w:sz w:val="24"/>
-          <w:szCs w:val="24"/>
-          <w:b/>
-        </w:rPr>
         <w:t xml:space="preserve">CERTIFICATE OF SERVICE</w:t>
       </w:r>
     </w:p>
     <w:p>
       <w:pPr>
         <w:jc w:val="both"/>
-        <w:spacing w:line="480" w:lineRule="auto"/>
+        <w:spacing w:after="0" w:line="480" w:lineRule="auto"/>
       </w:pPr>
       <w:r>
         <w:rPr>
@@ -548,6 +643,34 @@
           <w:szCs w:val="24"/>
         </w:rPr>
         <w:t xml:space="preserve">I will serve a copy of this paper myself. This software did not serve anyone.</w:t>
+      </w:r>
+    </w:p>
+    <w:p>
+      <w:pPr>
+        <w:jc w:val="both"/>
+        <w:spacing w:after="0" w:line="480" w:lineRule="auto"/>
+      </w:pPr>
+      <w:r>
+        <w:rPr>
+          <w:rFonts w:ascii="Times New Roman" w:hAnsi="Times New Roman" w:cs="Times New Roman"/>
+          <w:sz w:val="24"/>
+          <w:szCs w:val="24"/>
+        </w:rPr>
+        <w:t xml:space="preserve">Date: October 16, 2026</w:t>
+      </w:r>
+    </w:p>
+    <w:p>
+      <w:pPr>
+        <w:jc w:val="both"/>
+        <w:spacing w:after="0" w:line="480" w:lineRule="auto"/>
+      </w:pPr>
+      <w:r>
+        <w:rPr>
+          <w:rFonts w:ascii="Times New Roman" w:hAnsi="Times New Roman" w:cs="Times New Roman"/>
+          <w:sz w:val="24"/>
+          <w:szCs w:val="24"/>
+        </w:rPr>
+        <w:t xml:space="preserve">/s/ Jordan Example</w:t>
       </w:r>
     </w:p>
     <w:sectPr>

</xml_diff>

<commit_message>
Block incomplete COS export, never auto-fill dates, keep flags off the paper
Export refuses a certificate of service that lacks a recipient, method, or
service date; preview may show a blank fill-in form. Signing and service
dates are Date: ____________ unless the user typed one. Strip
needs_verification from rendered text (it stays in YAML/UI). Use the same
COURT USE ONLY and Case Number: labels on NJ and CO, and even paragraph
leading so wrapped lines match.

Co-authored-by: Joshua M. Abrams <josh@truejust.org>
</commit_message>
<xml_diff>
--- a/docs/samples/co-appeals-motion-jordan-example.docx
+++ b/docs/samples/co-appeals-motion-jordan-example.docx
@@ -226,7 +226,7 @@
                 <w:sz w:val="20"/>
                 <w:szCs w:val="20"/>
               </w:rPr>
-              <w:t xml:space="preserve">▲ COURT USE ONLY ▲</w:t>
+              <w:t xml:space="preserve">COURT USE ONLY</w:t>
             </w:r>
           </w:p>
           <w:p>
@@ -362,7 +362,7 @@
           <w:sz w:val="24"/>
           <w:szCs w:val="24"/>
         </w:rPr>
-        <w:t xml:space="preserve">I conferred with the opposing party on October 1, 2026. The opposing party takes no position. Confirm whether C.R.C.P. 121 § 1-15(8) or the Colorado Appellate Rules govern this paper before filing. This paragraph is the user's own draft (needs_verification).</w:t>
+        <w:t xml:space="preserve">I conferred with the opposing party on October 1, 2026. The opposing party takes no position.</w:t>
       </w:r>
     </w:p>
     <w:p>
@@ -466,23 +466,23 @@
           <w:sz w:val="24"/>
           <w:szCs w:val="24"/>
         </w:rPr>
-        <w:t xml:space="preserve">I declare under penalty of perjury under the law of Colorado that the foregoing is true and correct. I signed this on October 16, 2026, at Example City, ST. This declaration is the user's own draft (needs_verification).</w:t>
-      </w:r>
-    </w:p>
-    <w:p>
-      <w:pPr>
-        <w:jc w:val="both"/>
-        <w:spacing w:after="0" w:line="240" w:lineRule="auto"/>
-        <w:keepNext/>
-        <w:keepLines/>
-      </w:pPr>
-      <w:r>
-        <w:rPr>
-          <w:rFonts w:ascii="Times New Roman" w:hAnsi="Times New Roman" w:cs="Times New Roman"/>
-          <w:sz w:val="24"/>
-          <w:szCs w:val="24"/>
-        </w:rPr>
-        <w:t xml:space="preserve">Date: October 16, 2026</w:t>
+        <w:t xml:space="preserve">I declare under penalty of perjury under the law of Colorado that the foregoing is true and correct. I signed this on October 2, 2026, at Example City, ST.</w:t>
+      </w:r>
+    </w:p>
+    <w:p>
+      <w:pPr>
+        <w:jc w:val="both"/>
+        <w:spacing w:after="0" w:line="240" w:lineRule="auto"/>
+        <w:keepNext/>
+        <w:keepLines/>
+      </w:pPr>
+      <w:r>
+        <w:rPr>
+          <w:rFonts w:ascii="Times New Roman" w:hAnsi="Times New Roman" w:cs="Times New Roman"/>
+          <w:sz w:val="24"/>
+          <w:szCs w:val="24"/>
+        </w:rPr>
+        <w:t xml:space="preserve">Date: ____________</w:t>
       </w:r>
     </w:p>
     <w:p>
@@ -656,7 +656,35 @@
           <w:sz w:val="24"/>
           <w:szCs w:val="24"/>
         </w:rPr>
-        <w:t xml:space="preserve">Date: October 16, 2026</w:t>
+        <w:t xml:space="preserve">Recipient: Sample County Clerk</w:t>
+      </w:r>
+    </w:p>
+    <w:p>
+      <w:pPr>
+        <w:jc w:val="both"/>
+        <w:spacing w:after="0" w:line="480" w:lineRule="auto"/>
+      </w:pPr>
+      <w:r>
+        <w:rPr>
+          <w:rFonts w:ascii="Times New Roman" w:hAnsi="Times New Roman" w:cs="Times New Roman"/>
+          <w:sz w:val="24"/>
+          <w:szCs w:val="24"/>
+        </w:rPr>
+        <w:t xml:space="preserve">Method: electronic mail</w:t>
+      </w:r>
+    </w:p>
+    <w:p>
+      <w:pPr>
+        <w:jc w:val="both"/>
+        <w:spacing w:after="0" w:line="480" w:lineRule="auto"/>
+      </w:pPr>
+      <w:r>
+        <w:rPr>
+          <w:rFonts w:ascii="Times New Roman" w:hAnsi="Times New Roman" w:cs="Times New Roman"/>
+          <w:sz w:val="24"/>
+          <w:szCs w:val="24"/>
+        </w:rPr>
+        <w:t xml:space="preserve">Date: October 1, 2026</w:t>
       </w:r>
     </w:p>
     <w:p>

</xml_diff>

<commit_message>
Use past-tense COS, refuse needs_verification in user text, left-align body
Certificate of service now states completed service ("I certify that on
[date] I served..."). Fixtures date service on or after signing. Export
blocks if the user wrote needs_verification in the paper (YAML metadata
is fine) instead of silently rewriting. COS errors list the exact missing
fields with parallel grammar. NJ and CO body text is left-aligned. The
desktop export_markdown_draft_cmd path shares those rules.

Co-authored-by: Joshua M. Abrams <josh@truejust.org>
</commit_message>
<xml_diff>
--- a/docs/samples/co-appeals-motion-jordan-example.docx
+++ b/docs/samples/co-appeals-motion-jordan-example.docx
@@ -24,7 +24,7 @@
           </w:tcPr>
           <w:p>
             <w:pPr>
-              <w:jc w:val="both"/>
+              <w:jc w:val="left"/>
               <w:spacing w:after="0" w:line="240" w:lineRule="auto"/>
             </w:pPr>
             <w:r>
@@ -38,7 +38,7 @@
           </w:p>
           <w:p>
             <w:pPr>
-              <w:jc w:val="both"/>
+              <w:jc w:val="left"/>
               <w:spacing w:after="0" w:line="240" w:lineRule="auto"/>
             </w:pPr>
             <w:r>
@@ -52,7 +52,7 @@
           </w:p>
           <w:p>
             <w:pPr>
-              <w:jc w:val="both"/>
+              <w:jc w:val="left"/>
               <w:spacing w:after="0" w:line="240" w:lineRule="auto"/>
             </w:pPr>
             <w:r>
@@ -66,7 +66,7 @@
           </w:p>
           <w:p>
             <w:pPr>
-              <w:jc w:val="both"/>
+              <w:jc w:val="left"/>
               <w:spacing w:after="0" w:line="240" w:lineRule="auto"/>
             </w:pPr>
             <w:r>
@@ -80,7 +80,7 @@
           </w:p>
           <w:p>
             <w:pPr>
-              <w:jc w:val="both"/>
+              <w:jc w:val="left"/>
               <w:spacing w:after="0" w:line="240" w:lineRule="auto"/>
             </w:pPr>
             <w:r>
@@ -94,7 +94,7 @@
           </w:p>
           <w:p>
             <w:pPr>
-              <w:jc w:val="both"/>
+              <w:jc w:val="left"/>
               <w:spacing w:after="0" w:line="240" w:lineRule="auto"/>
             </w:pPr>
             <w:r>
@@ -108,7 +108,7 @@
           </w:p>
           <w:p>
             <w:pPr>
-              <w:jc w:val="both"/>
+              <w:jc w:val="left"/>
               <w:spacing w:after="0" w:line="240" w:lineRule="auto"/>
             </w:pPr>
             <w:r>
@@ -122,7 +122,7 @@
           </w:p>
           <w:p>
             <w:pPr>
-              <w:jc w:val="both"/>
+              <w:jc w:val="left"/>
               <w:spacing w:after="0" w:line="240" w:lineRule="auto"/>
             </w:pPr>
             <w:r>
@@ -136,7 +136,7 @@
           </w:p>
           <w:p>
             <w:pPr>
-              <w:jc w:val="both"/>
+              <w:jc w:val="left"/>
               <w:spacing w:after="0" w:line="240" w:lineRule="auto"/>
             </w:pPr>
             <w:r>
@@ -150,7 +150,7 @@
           </w:p>
           <w:p>
             <w:pPr>
-              <w:jc w:val="both"/>
+              <w:jc w:val="left"/>
               <w:spacing w:after="0" w:line="240" w:lineRule="auto"/>
             </w:pPr>
             <w:r>
@@ -164,7 +164,7 @@
           </w:p>
           <w:p>
             <w:pPr>
-              <w:jc w:val="both"/>
+              <w:jc w:val="left"/>
               <w:spacing w:after="0" w:line="240" w:lineRule="auto"/>
             </w:pPr>
             <w:r>
@@ -178,7 +178,7 @@
           </w:p>
           <w:p>
             <w:pPr>
-              <w:jc w:val="both"/>
+              <w:jc w:val="left"/>
               <w:spacing w:after="0" w:line="240" w:lineRule="auto"/>
             </w:pPr>
             <w:r>
@@ -192,7 +192,7 @@
           </w:p>
           <w:p>
             <w:pPr>
-              <w:jc w:val="both"/>
+              <w:jc w:val="left"/>
               <w:spacing w:after="0" w:line="240" w:lineRule="auto"/>
             </w:pPr>
             <w:r>
@@ -217,7 +217,7 @@
           </w:tcPr>
           <w:p>
             <w:pPr>
-              <w:jc w:val="both"/>
+              <w:jc w:val="left"/>
               <w:spacing w:after="0" w:line="240" w:lineRule="auto"/>
             </w:pPr>
             <w:r>
@@ -231,7 +231,7 @@
           </w:p>
           <w:p>
             <w:pPr>
-              <w:jc w:val="both"/>
+              <w:jc w:val="left"/>
               <w:spacing w:after="0" w:line="240" w:lineRule="auto"/>
             </w:pPr>
             <w:r>
@@ -245,7 +245,7 @@
           </w:p>
           <w:p>
             <w:pPr>
-              <w:jc w:val="both"/>
+              <w:jc w:val="left"/>
               <w:spacing w:after="0" w:line="240" w:lineRule="auto"/>
             </w:pPr>
             <w:r>
@@ -259,7 +259,7 @@
           </w:p>
           <w:p>
             <w:pPr>
-              <w:jc w:val="both"/>
+              <w:jc w:val="left"/>
               <w:spacing w:after="0" w:line="240" w:lineRule="auto"/>
             </w:pPr>
             <w:r>
@@ -273,7 +273,7 @@
           </w:p>
           <w:p>
             <w:pPr>
-              <w:jc w:val="both"/>
+              <w:jc w:val="left"/>
               <w:spacing w:after="0" w:line="240" w:lineRule="auto"/>
             </w:pPr>
             <w:r>
@@ -324,7 +324,7 @@
     </w:p>
     <w:p>
       <w:pPr>
-        <w:jc w:val="both"/>
+        <w:jc w:val="left"/>
         <w:spacing w:after="200" w:line="480" w:lineRule="auto"/>
       </w:pPr>
       <w:r>
@@ -339,7 +339,7 @@
     </w:p>
     <w:p>
       <w:pPr>
-        <w:jc w:val="both"/>
+        <w:jc w:val="left"/>
         <w:spacing w:after="0" w:line="480" w:lineRule="auto"/>
       </w:pPr>
       <w:r>
@@ -353,7 +353,7 @@
     </w:p>
     <w:p>
       <w:pPr>
-        <w:jc w:val="both"/>
+        <w:jc w:val="left"/>
         <w:spacing w:after="0" w:line="480" w:lineRule="auto"/>
       </w:pPr>
       <w:r>
@@ -367,7 +367,7 @@
     </w:p>
     <w:p>
       <w:pPr>
-        <w:jc w:val="both"/>
+        <w:jc w:val="left"/>
         <w:spacing w:after="0" w:line="480" w:lineRule="auto"/>
       </w:pPr>
       <w:r>
@@ -381,7 +381,7 @@
     </w:p>
     <w:p>
       <w:pPr>
-        <w:jc w:val="both"/>
+        <w:jc w:val="left"/>
         <w:spacing w:after="200" w:line="480" w:lineRule="auto"/>
       </w:pPr>
       <w:r>
@@ -396,7 +396,7 @@
     </w:p>
     <w:p>
       <w:pPr>
-        <w:jc w:val="both"/>
+        <w:jc w:val="left"/>
         <w:spacing w:after="0" w:line="480" w:lineRule="auto"/>
       </w:pPr>
       <w:r>
@@ -410,7 +410,7 @@
     </w:p>
     <w:p>
       <w:pPr>
-        <w:jc w:val="both"/>
+        <w:jc w:val="left"/>
         <w:spacing w:after="0" w:line="480" w:lineRule="auto"/>
       </w:pPr>
       <w:r>
@@ -424,7 +424,7 @@
     </w:p>
     <w:p>
       <w:pPr>
-        <w:jc w:val="both"/>
+        <w:jc w:val="left"/>
         <w:spacing w:after="0" w:line="480" w:lineRule="auto"/>
       </w:pPr>
       <w:r>
@@ -455,7 +455,7 @@
     </w:p>
     <w:p>
       <w:pPr>
-        <w:jc w:val="both"/>
+        <w:jc w:val="left"/>
         <w:spacing w:after="160" w:line="480" w:lineRule="auto"/>
         <w:keepNext/>
         <w:keepLines/>
@@ -471,7 +471,7 @@
     </w:p>
     <w:p>
       <w:pPr>
-        <w:jc w:val="both"/>
+        <w:jc w:val="left"/>
         <w:spacing w:after="0" w:line="240" w:lineRule="auto"/>
         <w:keepNext/>
         <w:keepLines/>
@@ -487,7 +487,7 @@
     </w:p>
     <w:p>
       <w:pPr>
-        <w:jc w:val="both"/>
+        <w:jc w:val="left"/>
         <w:spacing w:after="0" w:line="240" w:lineRule="auto"/>
         <w:keepNext/>
         <w:keepLines/>
@@ -503,7 +503,7 @@
     </w:p>
     <w:p>
       <w:pPr>
-        <w:jc w:val="both"/>
+        <w:jc w:val="left"/>
         <w:spacing w:after="0" w:line="240" w:lineRule="auto"/>
         <w:keepNext/>
         <w:keepLines/>
@@ -519,7 +519,7 @@
     </w:p>
     <w:p>
       <w:pPr>
-        <w:jc w:val="both"/>
+        <w:jc w:val="left"/>
         <w:spacing w:after="0" w:line="240" w:lineRule="auto"/>
         <w:keepNext/>
         <w:keepLines/>
@@ -535,7 +535,7 @@
     </w:p>
     <w:p>
       <w:pPr>
-        <w:jc w:val="both"/>
+        <w:jc w:val="left"/>
         <w:spacing w:after="0" w:line="240" w:lineRule="auto"/>
         <w:keepNext/>
         <w:keepLines/>
@@ -551,7 +551,7 @@
     </w:p>
     <w:p>
       <w:pPr>
-        <w:jc w:val="both"/>
+        <w:jc w:val="left"/>
         <w:spacing w:after="0" w:line="240" w:lineRule="auto"/>
         <w:keepNext/>
         <w:keepLines/>
@@ -567,7 +567,7 @@
     </w:p>
     <w:p>
       <w:pPr>
-        <w:jc w:val="both"/>
+        <w:jc w:val="left"/>
         <w:spacing w:after="0" w:line="240" w:lineRule="auto"/>
         <w:keepNext/>
         <w:keepLines/>
@@ -583,7 +583,7 @@
     </w:p>
     <w:p>
       <w:pPr>
-        <w:jc w:val="both"/>
+        <w:jc w:val="left"/>
         <w:spacing w:after="0" w:line="240" w:lineRule="auto"/>
         <w:keepNext/>
         <w:keepLines/>
@@ -599,7 +599,7 @@
     </w:p>
     <w:p>
       <w:pPr>
-        <w:jc w:val="both"/>
+        <w:jc w:val="left"/>
         <w:spacing w:after="0" w:line="240" w:lineRule="auto"/>
       </w:pPr>
       <w:r>
@@ -633,63 +633,21 @@
     </w:p>
     <w:p>
       <w:pPr>
-        <w:jc w:val="both"/>
-        <w:spacing w:after="0" w:line="480" w:lineRule="auto"/>
-      </w:pPr>
-      <w:r>
-        <w:rPr>
-          <w:rFonts w:ascii="Times New Roman" w:hAnsi="Times New Roman" w:cs="Times New Roman"/>
-          <w:sz w:val="24"/>
-          <w:szCs w:val="24"/>
-        </w:rPr>
-        <w:t xml:space="preserve">I will serve a copy of this paper myself. This software did not serve anyone.</w:t>
-      </w:r>
-    </w:p>
-    <w:p>
-      <w:pPr>
-        <w:jc w:val="both"/>
-        <w:spacing w:after="0" w:line="480" w:lineRule="auto"/>
-      </w:pPr>
-      <w:r>
-        <w:rPr>
-          <w:rFonts w:ascii="Times New Roman" w:hAnsi="Times New Roman" w:cs="Times New Roman"/>
-          <w:sz w:val="24"/>
-          <w:szCs w:val="24"/>
-        </w:rPr>
-        <w:t xml:space="preserve">Recipient: Sample County Clerk</w:t>
-      </w:r>
-    </w:p>
-    <w:p>
-      <w:pPr>
-        <w:jc w:val="both"/>
-        <w:spacing w:after="0" w:line="480" w:lineRule="auto"/>
-      </w:pPr>
-      <w:r>
-        <w:rPr>
-          <w:rFonts w:ascii="Times New Roman" w:hAnsi="Times New Roman" w:cs="Times New Roman"/>
-          <w:sz w:val="24"/>
-          <w:szCs w:val="24"/>
-        </w:rPr>
-        <w:t xml:space="preserve">Method: electronic mail</w:t>
-      </w:r>
-    </w:p>
-    <w:p>
-      <w:pPr>
-        <w:jc w:val="both"/>
-        <w:spacing w:after="0" w:line="480" w:lineRule="auto"/>
-      </w:pPr>
-      <w:r>
-        <w:rPr>
-          <w:rFonts w:ascii="Times New Roman" w:hAnsi="Times New Roman" w:cs="Times New Roman"/>
-          <w:sz w:val="24"/>
-          <w:szCs w:val="24"/>
-        </w:rPr>
-        <w:t xml:space="preserve">Date: October 1, 2026</w:t>
-      </w:r>
-    </w:p>
-    <w:p>
-      <w:pPr>
-        <w:jc w:val="both"/>
+        <w:jc w:val="left"/>
+        <w:spacing w:after="0" w:line="480" w:lineRule="auto"/>
+      </w:pPr>
+      <w:r>
+        <w:rPr>
+          <w:rFonts w:ascii="Times New Roman" w:hAnsi="Times New Roman" w:cs="Times New Roman"/>
+          <w:sz w:val="24"/>
+          <w:szCs w:val="24"/>
+        </w:rPr>
+        <w:t xml:space="preserve">I certify that on October 2, 2026 I served a copy of this motion on Sample County Clerk by electronic mail.</w:t>
+      </w:r>
+    </w:p>
+    <w:p>
+      <w:pPr>
+        <w:jc w:val="left"/>
         <w:spacing w:after="0" w:line="480" w:lineRule="auto"/>
       </w:pPr>
       <w:r>

</xml_diff>